<commit_message>
Modifiche progetto, aggiornamento documentazione
</commit_message>
<xml_diff>
--- a/manuali/Manuale Tecnico.docx
+++ b/manuali/Manuale Tecnico.docx
@@ -115,7 +115,13 @@
         <w:rPr>
           <w:rFonts w:cstheme="minorHAnsi"/>
         </w:rPr>
-        <w:t xml:space="preserve"> 0.2</w:t>
+        <w:t xml:space="preserve"> </w:t>
+      </w:r>
+      <w:r>
+        <w:rPr>
+          <w:rFonts w:cstheme="minorHAnsi"/>
+        </w:rPr>
+        <w:t>0.5</w:t>
       </w:r>
     </w:p>
     <w:p>
@@ -168,21 +174,7 @@
             <w:rStyle w:val="Collegamentoipertestuale"/>
             <w:rFonts w:cstheme="minorHAnsi"/>
           </w:rPr>
-          <w:t>Struttur</w:t>
-        </w:r>
-        <w:r>
-          <w:rPr>
-            <w:rStyle w:val="Collegamentoipertestuale"/>
-            <w:rFonts w:cstheme="minorHAnsi"/>
-          </w:rPr>
-          <w:t>a</w:t>
-        </w:r>
-        <w:r>
-          <w:rPr>
-            <w:rStyle w:val="Collegamentoipertestuale"/>
-            <w:rFonts w:cstheme="minorHAnsi"/>
-          </w:rPr>
-          <w:t xml:space="preserve"> dell’applicazione</w:t>
+          <w:t>Struttura dell’applicazione</w:t>
         </w:r>
       </w:hyperlink>
     </w:p>
@@ -297,29 +289,27 @@
         </w:rPr>
       </w:pPr>
       <w:hyperlink w:anchor="JavaDoc" w:history="1">
-        <w:proofErr w:type="spellStart"/>
         <w:r>
           <w:rPr>
             <w:rStyle w:val="Collegamentoipertestuale"/>
             <w:rFonts w:cstheme="minorHAnsi"/>
           </w:rPr>
-          <w:t>Java</w:t>
+          <w:t>JavaD</w:t>
         </w:r>
         <w:r>
           <w:rPr>
             <w:rStyle w:val="Collegamentoipertestuale"/>
             <w:rFonts w:cstheme="minorHAnsi"/>
           </w:rPr>
-          <w:t>D</w:t>
+          <w:t>o</w:t>
         </w:r>
         <w:r>
           <w:rPr>
             <w:rStyle w:val="Collegamentoipertestuale"/>
             <w:rFonts w:cstheme="minorHAnsi"/>
           </w:rPr>
-          <w:t>oc</w:t>
+          <w:t>c</w:t>
         </w:r>
-        <w:proofErr w:type="spellEnd"/>
       </w:hyperlink>
     </w:p>
     <w:p>
@@ -376,21 +366,7 @@
         <w:rPr>
           <w:rFonts w:cstheme="minorHAnsi"/>
         </w:rPr>
-        <w:t xml:space="preserve"> non adotta una divisione in pacchetti convenzionali (es. model, controller, </w:t>
-      </w:r>
-      <w:proofErr w:type="spellStart"/>
-      <w:r>
-        <w:rPr>
-          <w:rFonts w:cstheme="minorHAnsi"/>
-        </w:rPr>
-        <w:t>view</w:t>
-      </w:r>
-      <w:proofErr w:type="spellEnd"/>
-      <w:r>
-        <w:rPr>
-          <w:rFonts w:cstheme="minorHAnsi"/>
-        </w:rPr>
-        <w:t>), ma si basa su una struttura semplice e lineare.</w:t>
+        <w:t xml:space="preserve"> non adotta una divisione in pacchetti convenzionali (es. model, controller, view), ma si basa su una struttura semplice e lineare.</w:t>
       </w:r>
     </w:p>
     <w:p>
@@ -416,29 +392,7 @@
           <w:rFonts w:cstheme="minorHAnsi"/>
         </w:rPr>
         <w:br/>
-        <w:t xml:space="preserve">È il punto di ingresso dell'applicazione. Contiene il metodo </w:t>
-      </w:r>
-      <w:proofErr w:type="spellStart"/>
-      <w:proofErr w:type="gramStart"/>
-      <w:r>
-        <w:rPr>
-          <w:rFonts w:cstheme="minorHAnsi"/>
-        </w:rPr>
-        <w:t>main</w:t>
-      </w:r>
-      <w:proofErr w:type="spellEnd"/>
-      <w:r>
-        <w:rPr>
-          <w:rFonts w:cstheme="minorHAnsi"/>
-        </w:rPr>
-        <w:t>(</w:t>
-      </w:r>
-      <w:proofErr w:type="gramEnd"/>
-      <w:r>
-        <w:rPr>
-          <w:rFonts w:cstheme="minorHAnsi"/>
-        </w:rPr>
-        <w:t>) e invoca il Manager per avviare l’intero flusso logico.</w:t>
+        <w:t>È il punto di ingresso dell'applicazione. Contiene il metodo main() e invoca il Manager per avviare l’intero flusso logico.</w:t>
       </w:r>
     </w:p>
     <w:p>
@@ -490,35 +444,7 @@
           <w:rFonts w:cstheme="minorHAnsi"/>
         </w:rPr>
         <w:br/>
-        <w:t xml:space="preserve">Si occupa della lettura e scrittura dei dati da e verso i file CSV. Centralizza la gestione delle I/O tramite </w:t>
-      </w:r>
-      <w:proofErr w:type="spellStart"/>
-      <w:r>
-        <w:rPr>
-          <w:rFonts w:cstheme="minorHAnsi"/>
-        </w:rPr>
-        <w:t>BufferedReader</w:t>
-      </w:r>
-      <w:proofErr w:type="spellEnd"/>
-      <w:r>
-        <w:rPr>
-          <w:rFonts w:cstheme="minorHAnsi"/>
-        </w:rPr>
-        <w:t xml:space="preserve"> e </w:t>
-      </w:r>
-      <w:proofErr w:type="spellStart"/>
-      <w:r>
-        <w:rPr>
-          <w:rFonts w:cstheme="minorHAnsi"/>
-        </w:rPr>
-        <w:t>BufferedWriter</w:t>
-      </w:r>
-      <w:proofErr w:type="spellEnd"/>
-      <w:r>
-        <w:rPr>
-          <w:rFonts w:cstheme="minorHAnsi"/>
-        </w:rPr>
-        <w:t>.</w:t>
+        <w:t>Si occupa della lettura e scrittura dei dati da e verso i file CSV. Centralizza la gestione delle I/O tramite BufferedReader e BufferedWriter.</w:t>
       </w:r>
     </w:p>
     <w:p>
@@ -571,35 +497,7 @@
         <w:rPr>
           <w:rFonts w:cstheme="minorHAnsi"/>
         </w:rPr>
-        <w:t xml:space="preserve">L'applicazione non segue un pattern architetturale formale come MVC o </w:t>
-      </w:r>
-      <w:proofErr w:type="spellStart"/>
-      <w:r>
-        <w:rPr>
-          <w:rFonts w:cstheme="minorHAnsi"/>
-        </w:rPr>
-        <w:t>layered</w:t>
-      </w:r>
-      <w:proofErr w:type="spellEnd"/>
-      <w:r>
-        <w:rPr>
-          <w:rFonts w:cstheme="minorHAnsi"/>
-        </w:rPr>
-        <w:t xml:space="preserve"> </w:t>
-      </w:r>
-      <w:proofErr w:type="spellStart"/>
-      <w:r>
-        <w:rPr>
-          <w:rFonts w:cstheme="minorHAnsi"/>
-        </w:rPr>
-        <w:t>architecture</w:t>
-      </w:r>
-      <w:proofErr w:type="spellEnd"/>
-      <w:r>
-        <w:rPr>
-          <w:rFonts w:cstheme="minorHAnsi"/>
-        </w:rPr>
-        <w:t xml:space="preserve">. È progettata come una </w:t>
+        <w:t xml:space="preserve">L'applicazione non segue un pattern architetturale formale come MVC o layered architecture. È progettata come una </w:t>
       </w:r>
       <w:r>
         <w:rPr>
@@ -710,23 +608,13 @@
           <w:rFonts w:cstheme="minorHAnsi"/>
         </w:rPr>
       </w:pPr>
-      <w:proofErr w:type="spellStart"/>
-      <w:r>
-        <w:rPr>
-          <w:rFonts w:cstheme="minorHAnsi"/>
-          <w:b/>
-          <w:bCs/>
-        </w:rPr>
-        <w:t>ArrayList</w:t>
-      </w:r>
-      <w:proofErr w:type="spellEnd"/>
-      <w:r>
-        <w:rPr>
-          <w:rFonts w:cstheme="minorHAnsi"/>
-          <w:b/>
-          <w:bCs/>
-        </w:rPr>
-        <w:t>&lt;T&gt;</w:t>
+      <w:r>
+        <w:rPr>
+          <w:rFonts w:cstheme="minorHAnsi"/>
+          <w:b/>
+          <w:bCs/>
+        </w:rPr>
+        <w:t>ArrayList&lt;T&gt;</w:t>
       </w:r>
       <w:r>
         <w:rPr>
@@ -877,19 +765,11 @@
           <w:rFonts w:cstheme="minorHAnsi"/>
         </w:rPr>
       </w:pPr>
-      <w:proofErr w:type="spellStart"/>
-      <w:r>
-        <w:rPr>
-          <w:rFonts w:cstheme="minorHAnsi"/>
-        </w:rPr>
-        <w:t>FasciaPrezzo</w:t>
-      </w:r>
-      <w:proofErr w:type="spellEnd"/>
-      <w:r>
-        <w:rPr>
-          <w:rFonts w:cstheme="minorHAnsi"/>
-        </w:rPr>
-        <w:t>: enumerazione che rappresenta la fascia di prezzo (es. ECONOMICO, MEDIO, ALTO).</w:t>
+      <w:r>
+        <w:rPr>
+          <w:rFonts w:cstheme="minorHAnsi"/>
+        </w:rPr>
+        <w:t>FasciaPrezzo: enumerazione che rappresenta la fascia di prezzo (es. ECONOMICO, MEDIO, ALTO).</w:t>
       </w:r>
     </w:p>
     <w:p>
@@ -1064,21 +944,7 @@
         <w:rPr>
           <w:rFonts w:cstheme="minorHAnsi"/>
         </w:rPr>
-        <w:t xml:space="preserve">Ricerca dell’utente tramite </w:t>
-      </w:r>
-      <w:proofErr w:type="spellStart"/>
-      <w:r>
-        <w:rPr>
-          <w:rFonts w:cstheme="minorHAnsi"/>
-        </w:rPr>
-        <w:t>ArrayList</w:t>
-      </w:r>
-      <w:proofErr w:type="spellEnd"/>
-      <w:r>
-        <w:rPr>
-          <w:rFonts w:cstheme="minorHAnsi"/>
-        </w:rPr>
-        <w:t>&lt;Utente&gt;.</w:t>
+        <w:t>Ricerca dell’utente tramite ArrayList&lt;Utente&gt;.</w:t>
       </w:r>
     </w:p>
     <w:p>
@@ -1112,21 +978,7 @@
         <w:rPr>
           <w:rFonts w:cstheme="minorHAnsi"/>
         </w:rPr>
-        <w:t xml:space="preserve">Nessuna cifratura, salvataggio </w:t>
-      </w:r>
-      <w:proofErr w:type="spellStart"/>
-      <w:r>
-        <w:rPr>
-          <w:rFonts w:cstheme="minorHAnsi"/>
-        </w:rPr>
-        <w:t>plaintext</w:t>
-      </w:r>
-      <w:proofErr w:type="spellEnd"/>
-      <w:r>
-        <w:rPr>
-          <w:rFonts w:cstheme="minorHAnsi"/>
-        </w:rPr>
-        <w:t xml:space="preserve"> nei CSV.</w:t>
+        <w:t>Nessuna cifratura, salvataggio plaintext nei CSV.</w:t>
       </w:r>
     </w:p>
     <w:p>
@@ -1257,35 +1109,7 @@
           <w:rFonts w:cstheme="minorHAnsi"/>
         </w:rPr>
         <w:lastRenderedPageBreak/>
-        <w:t xml:space="preserve">In fase di avvio: caricati in memoria tramite </w:t>
-      </w:r>
-      <w:proofErr w:type="spellStart"/>
-      <w:r>
-        <w:rPr>
-          <w:rFonts w:cstheme="minorHAnsi"/>
-        </w:rPr>
-        <w:t>FileManager</w:t>
-      </w:r>
-      <w:proofErr w:type="spellEnd"/>
-      <w:r>
-        <w:rPr>
-          <w:rFonts w:cstheme="minorHAnsi"/>
-        </w:rPr>
-        <w:t xml:space="preserve"> usando </w:t>
-      </w:r>
-      <w:proofErr w:type="spellStart"/>
-      <w:r>
-        <w:rPr>
-          <w:rFonts w:cstheme="minorHAnsi"/>
-        </w:rPr>
-        <w:t>BufferedReader</w:t>
-      </w:r>
-      <w:proofErr w:type="spellEnd"/>
-      <w:r>
-        <w:rPr>
-          <w:rFonts w:cstheme="minorHAnsi"/>
-        </w:rPr>
-        <w:t>.</w:t>
+        <w:t>In fase di avvio: caricati in memoria tramite FileManager usando BufferedReader.</w:t>
       </w:r>
     </w:p>
     <w:p>
@@ -1302,48 +1126,20 @@
         <w:rPr>
           <w:rFonts w:cstheme="minorHAnsi"/>
         </w:rPr>
-        <w:t xml:space="preserve">In fase di chiusura/modifica: scritti con </w:t>
-      </w:r>
-      <w:proofErr w:type="spellStart"/>
-      <w:r>
-        <w:rPr>
-          <w:rFonts w:cstheme="minorHAnsi"/>
-        </w:rPr>
-        <w:t>BufferedWriter</w:t>
-      </w:r>
-      <w:proofErr w:type="spellEnd"/>
-      <w:r>
-        <w:rPr>
-          <w:rFonts w:cstheme="minorHAnsi"/>
-        </w:rPr>
-        <w:t>.</w:t>
-      </w:r>
-    </w:p>
-    <w:p>
-      <w:pPr>
-        <w:rPr>
-          <w:rFonts w:cstheme="minorHAnsi"/>
-        </w:rPr>
-      </w:pPr>
-      <w:r>
-        <w:rPr>
-          <w:rFonts w:cstheme="minorHAnsi"/>
-        </w:rPr>
-        <w:t xml:space="preserve">I </w:t>
-      </w:r>
-      <w:proofErr w:type="spellStart"/>
-      <w:r>
-        <w:rPr>
-          <w:rFonts w:cstheme="minorHAnsi"/>
-        </w:rPr>
-        <w:t>path</w:t>
-      </w:r>
-      <w:proofErr w:type="spellEnd"/>
-      <w:r>
-        <w:rPr>
-          <w:rFonts w:cstheme="minorHAnsi"/>
-        </w:rPr>
-        <w:t xml:space="preserve"> sono </w:t>
+        <w:t>In fase di chiusura/modifica: scritti con BufferedWriter.</w:t>
+      </w:r>
+    </w:p>
+    <w:p>
+      <w:pPr>
+        <w:rPr>
+          <w:rFonts w:cstheme="minorHAnsi"/>
+        </w:rPr>
+      </w:pPr>
+      <w:r>
+        <w:rPr>
+          <w:rFonts w:cstheme="minorHAnsi"/>
+        </w:rPr>
+        <w:t xml:space="preserve">I path sono </w:t>
       </w:r>
       <w:r>
         <w:rPr>
@@ -1387,121 +1183,20 @@
         <w:rPr>
           <w:rFonts w:cstheme="minorHAnsi"/>
         </w:rPr>
-        <w:t xml:space="preserve">public </w:t>
-      </w:r>
-      <w:proofErr w:type="spellStart"/>
-      <w:r>
-        <w:rPr>
-          <w:rFonts w:cstheme="minorHAnsi"/>
-        </w:rPr>
-        <w:t>static</w:t>
-      </w:r>
-      <w:proofErr w:type="spellEnd"/>
-      <w:r>
-        <w:rPr>
-          <w:rFonts w:cstheme="minorHAnsi"/>
-        </w:rPr>
-        <w:t xml:space="preserve"> </w:t>
-      </w:r>
-      <w:proofErr w:type="spellStart"/>
-      <w:r>
-        <w:rPr>
-          <w:rFonts w:cstheme="minorHAnsi"/>
-        </w:rPr>
-        <w:t>final</w:t>
-      </w:r>
-      <w:proofErr w:type="spellEnd"/>
-      <w:r>
-        <w:rPr>
-          <w:rFonts w:cstheme="minorHAnsi"/>
-        </w:rPr>
-        <w:t xml:space="preserve"> </w:t>
-      </w:r>
-      <w:proofErr w:type="spellStart"/>
-      <w:r>
-        <w:rPr>
-          <w:rFonts w:cstheme="minorHAnsi"/>
-        </w:rPr>
-        <w:t>String</w:t>
-      </w:r>
-      <w:proofErr w:type="spellEnd"/>
-      <w:r>
-        <w:rPr>
-          <w:rFonts w:cstheme="minorHAnsi"/>
-        </w:rPr>
-        <w:t xml:space="preserve"> PATH_UTENTI = "data/utenti.csv";</w:t>
-      </w:r>
-    </w:p>
-    <w:p>
-      <w:pPr>
-        <w:rPr>
-          <w:rFonts w:cstheme="minorHAnsi"/>
-        </w:rPr>
-      </w:pPr>
-    </w:p>
-    <w:p>
-      <w:pPr>
-        <w:rPr>
-          <w:rFonts w:cstheme="minorHAnsi"/>
-        </w:rPr>
-      </w:pPr>
-      <w:proofErr w:type="spellStart"/>
-      <w:r>
-        <w:rPr>
-          <w:rFonts w:cstheme="minorHAnsi"/>
-        </w:rPr>
-        <w:t>BufferedReader</w:t>
-      </w:r>
-      <w:proofErr w:type="spellEnd"/>
-      <w:r>
-        <w:rPr>
-          <w:rFonts w:cstheme="minorHAnsi"/>
-        </w:rPr>
-        <w:t xml:space="preserve"> reader = new </w:t>
-      </w:r>
-      <w:proofErr w:type="spellStart"/>
-      <w:proofErr w:type="gramStart"/>
-      <w:r>
-        <w:rPr>
-          <w:rFonts w:cstheme="minorHAnsi"/>
-        </w:rPr>
-        <w:t>BufferedReader</w:t>
-      </w:r>
-      <w:proofErr w:type="spellEnd"/>
-      <w:r>
-        <w:rPr>
-          <w:rFonts w:cstheme="minorHAnsi"/>
-        </w:rPr>
-        <w:t>(</w:t>
-      </w:r>
-      <w:proofErr w:type="gramEnd"/>
-      <w:r>
-        <w:rPr>
-          <w:rFonts w:cstheme="minorHAnsi"/>
-        </w:rPr>
-        <w:t xml:space="preserve">new </w:t>
-      </w:r>
-      <w:proofErr w:type="spellStart"/>
-      <w:proofErr w:type="gramStart"/>
-      <w:r>
-        <w:rPr>
-          <w:rFonts w:cstheme="minorHAnsi"/>
-        </w:rPr>
-        <w:t>FileReader</w:t>
-      </w:r>
-      <w:proofErr w:type="spellEnd"/>
-      <w:r>
-        <w:rPr>
-          <w:rFonts w:cstheme="minorHAnsi"/>
-        </w:rPr>
-        <w:t>(</w:t>
-      </w:r>
-      <w:proofErr w:type="gramEnd"/>
-      <w:r>
-        <w:rPr>
-          <w:rFonts w:cstheme="minorHAnsi"/>
-        </w:rPr>
-        <w:t>PATH_UTENTI));</w:t>
+        <w:t>public static final String PATH_UTENTI = "data/utenti.csv";</w:t>
+      </w:r>
+    </w:p>
+    <w:p>
+      <w:pPr>
+        <w:rPr>
+          <w:rFonts w:cstheme="minorHAnsi"/>
+        </w:rPr>
+      </w:pPr>
+      <w:r>
+        <w:rPr>
+          <w:rFonts w:cstheme="minorHAnsi"/>
+        </w:rPr>
+        <w:t>BufferedReader reader = new BufferedReader(new FileReader(PATH_UTENTI));</w:t>
       </w:r>
     </w:p>
     <w:p>
@@ -1600,6 +1295,7 @@
       <w:r>
         <w:rPr>
           <w:rFonts w:cstheme="minorHAnsi"/>
+          <w:noProof/>
         </w:rPr>
         <w:drawing>
           <wp:inline distT="0" distB="0" distL="0" distR="0" wp14:anchorId="4972195F" wp14:editId="0F58BB4E">
@@ -1659,7 +1355,6 @@
         <w:t xml:space="preserve">7. </w:t>
       </w:r>
       <w:bookmarkStart w:id="6" w:name="JavaDoc"/>
-      <w:proofErr w:type="spellStart"/>
       <w:r>
         <w:rPr>
           <w:rFonts w:cstheme="minorHAnsi"/>
@@ -1671,7 +1366,6 @@
         <w:t>JavaDoc</w:t>
       </w:r>
       <w:bookmarkEnd w:id="6"/>
-      <w:proofErr w:type="spellEnd"/>
     </w:p>
     <w:p>
       <w:pPr>
@@ -1685,7 +1379,6 @@
         </w:rPr>
         <w:t xml:space="preserve">Tutte le classi e metodi principali sono correttamente documentati tramite </w:t>
       </w:r>
-      <w:proofErr w:type="spellStart"/>
       <w:r>
         <w:rPr>
           <w:rFonts w:cstheme="minorHAnsi"/>
@@ -1694,7 +1387,6 @@
         </w:rPr>
         <w:t>JavaDoc</w:t>
       </w:r>
-      <w:proofErr w:type="spellEnd"/>
       <w:r>
         <w:rPr>
           <w:rFonts w:cstheme="minorHAnsi"/>
@@ -1712,21 +1404,7 @@
         <w:rPr>
           <w:rFonts w:cstheme="minorHAnsi"/>
         </w:rPr>
-        <w:t xml:space="preserve">Il </w:t>
-      </w:r>
-      <w:proofErr w:type="spellStart"/>
-      <w:r>
-        <w:rPr>
-          <w:rFonts w:cstheme="minorHAnsi"/>
-        </w:rPr>
-        <w:t>JavaDoc</w:t>
-      </w:r>
-      <w:proofErr w:type="spellEnd"/>
-      <w:r>
-        <w:rPr>
-          <w:rFonts w:cstheme="minorHAnsi"/>
-        </w:rPr>
-        <w:t xml:space="preserve"> di questo progetto è presente nella documentazione di quest’ultimo assieme ai manuali.</w:t>
+        <w:t>Il JavaDoc di questo progetto è presente nella documentazione di quest’ultimo assieme ai manuali.</w:t>
       </w:r>
     </w:p>
     <w:sectPr>
@@ -3375,6 +3053,7 @@
   <w:style w:type="character" w:default="1" w:styleId="Carpredefinitoparagrafo">
     <w:name w:val="Default Paragraph Font"/>
     <w:uiPriority w:val="1"/>
+    <w:semiHidden/>
     <w:unhideWhenUsed/>
   </w:style>
   <w:style w:type="table" w:default="1" w:styleId="Tabellanormale">

</xml_diff>